<commit_message>
Proper review-form re-audit + formatting sweep: Fig 6 axis units, docx table fixes, conference docs archived
- conference_docs/: Review Form + Acceptance Notification archived read-only
  (gitignored; checksum-verified against the originals)
- Fig 6 re-rendered with explicit axis units (X/Y/Z in m), dark 24pt labels,
  legible at column width per review item 7
- docx: bracket-escaped table citations (pandoc ate [n] after row breaks),
  widened Ref columns via the tex spec, preview exports now use a throwaway
  copy so Word can never rewrite the deliverable
- Verified item 5 against the original submission's own displayed numbering

Claude-Session: https://claude.ai/code/session_01AMoijeFAwRta8G5gow2JBF
</commit_message>
<xml_diff>
--- a/conference_paper/docx_build/IQCR_ICACR2026_final.docx
+++ b/conference_paper/docx_build/IQCR_ICACR2026_final.docx
@@ -179,7 +179,52 @@
         <w:pStyle w:val="a3"/>
       </w:pPr>
       <w:r>
-        <w:t xml:space="preserve">Vision-based detectors make up most of the recent inspection literature, and a lot of the accuracy gains come from adapting the network to the specific defect domain instead of reusing a general-purpose detector off the shelf. Akhyar et al. built the Forceful Defect Detector this way, adapting a detection backbone to the low-contrast, irregular texture of steel surface flaws; it beat general-purpose networks on precision, though the authors point out that inference speed and false positives both still matter once the detector has to run on a moving line [1]. Zhao et al. took a similar approach with RDD-YOLO, building on YOLOv5 with a Res2Net backbone, a double Feature Pyramid Network, and a decoupled detection head, and it beat baseline YOLO variants on both accuracy and recall, especially on small defects (Table I) [2]. Bagherzadeh et al. went a different direction and surveyed dataset labeling quality instead of model architecture, looking across public benchmarks like NEU-DET and Alibaba’s Aluminum Profile Surface Detection Database, and concluded that how consistently the data is labeled matters at least as much as which architecture gets used [3]. A 2024 systematic review in</w:t>
+        <w:t xml:space="preserve">Vision-based detectors make up most of the recent inspection literature, and a lot of the accuracy gains come from adapting the network to the specific defect domain instead of reusing a general-purpose detector off the shelf. Akhyar et al. built the Forceful Defect Detector this way, adapting a detection backbone to the low-contrast, irregular texture of steel surface flaws; it beat general-purpose networks on precision, though the authors point out that inference speed and false positives both still matter once the detector has to run on a moving line</w:t>
+      </w:r>
+      <w:r>
+        <w:t xml:space="preserve"> </w:t>
+      </w:r>
+      <w:r>
+        <w:t xml:space="preserve">[</w:t>
+      </w:r>
+      <w:r>
+        <w:t xml:space="preserve">1</w:t>
+      </w:r>
+      <w:r>
+        <w:t xml:space="preserve">]</w:t>
+      </w:r>
+      <w:r>
+        <w:t xml:space="preserve">. Zhao et al. took a similar approach with RDD-YOLO, building on YOLOv5 with a Res2Net backbone, a double Feature Pyramid Network, and a decoupled detection head, and it beat baseline YOLO variants on both accuracy and recall, especially on small defects (Table I)</w:t>
+      </w:r>
+      <w:r>
+        <w:t xml:space="preserve"> </w:t>
+      </w:r>
+      <w:r>
+        <w:t xml:space="preserve">[</w:t>
+      </w:r>
+      <w:r>
+        <w:t xml:space="preserve">2</w:t>
+      </w:r>
+      <w:r>
+        <w:t xml:space="preserve">]</w:t>
+      </w:r>
+      <w:r>
+        <w:t xml:space="preserve">. Bagherzadeh et al. went a different direction and surveyed dataset labeling quality instead of model architecture, looking across public benchmarks like NEU-DET and Alibaba’s Aluminum Profile Surface Detection Database, and concluded that how consistently the data is labeled matters at least as much as which architecture gets used</w:t>
+      </w:r>
+      <w:r>
+        <w:t xml:space="preserve"> </w:t>
+      </w:r>
+      <w:r>
+        <w:t xml:space="preserve">[</w:t>
+      </w:r>
+      <w:r>
+        <w:t xml:space="preserve">3</w:t>
+      </w:r>
+      <w:r>
+        <w:t xml:space="preserve">]</w:t>
+      </w:r>
+      <w:r>
+        <w:t xml:space="preserve">. A 2024 systematic review in</w:t>
       </w:r>
       <w:r>
         <w:t xml:space="preserve"> </w:t>
@@ -195,7 +240,37 @@
         <w:t xml:space="preserve"> </w:t>
       </w:r>
       <w:r>
-        <w:t xml:space="preserve">normalized train/test splits across a range of published detection architectures, covering work from 2020 to 2023, and reported a handful of things worth flagging: performance gaps between competing models shrink once the comparison conditions are standardized, supervised detection still dominates the field despite its labeling cost, inspection alone can eat up over half of total manufacturing time in some processes, and dataset imbalance between defective and non-defective samples is still the field’s most persistent open problem [4]. Chen et al. took a different angle from a single camera, pairing a coaxial melt-pool camera, an acoustic microphone, and a thermal camera on a robotic laser-directed energy deposition arm and syncing all three with the arm’s motion in time and space, which showed that single-mode vision misses defects that only show up thermally or acoustically [5].</w:t>
+        <w:t xml:space="preserve">normalized train/test splits across a range of published detection architectures, covering work from 2020 to 2023, and reported a handful of things worth flagging: performance gaps between competing models shrink once the comparison conditions are standardized, supervised detection still dominates the field despite its labeling cost, inspection alone can eat up over half of total manufacturing time in some processes, and dataset imbalance between defective and non-defective samples is still the field’s most persistent open problem</w:t>
+      </w:r>
+      <w:r>
+        <w:t xml:space="preserve"> </w:t>
+      </w:r>
+      <w:r>
+        <w:t xml:space="preserve">[</w:t>
+      </w:r>
+      <w:r>
+        <w:t xml:space="preserve">4</w:t>
+      </w:r>
+      <w:r>
+        <w:t xml:space="preserve">]</w:t>
+      </w:r>
+      <w:r>
+        <w:t xml:space="preserve">. Chen et al. took a different angle from a single camera, pairing a coaxial melt-pool camera, an acoustic microphone, and a thermal camera on a robotic laser-directed energy deposition arm and syncing all three with the arm’s motion in time and space, which showed that single-mode vision misses defects that only show up thermally or acoustically</w:t>
+      </w:r>
+      <w:r>
+        <w:t xml:space="preserve"> </w:t>
+      </w:r>
+      <w:r>
+        <w:t xml:space="preserve">[</w:t>
+      </w:r>
+      <w:r>
+        <w:t xml:space="preserve">5</w:t>
+      </w:r>
+      <w:r>
+        <w:t xml:space="preserve">]</w:t>
+      </w:r>
+      <w:r>
+        <w:t xml:space="preserve">.</w:t>
       </w:r>
     </w:p>
     <w:bookmarkStart w:id="10" w:name="tab:rddyolo"/>
@@ -204,7 +279,19 @@
         <w:pStyle w:val="tablehead"/>
       </w:pPr>
       <w:r>
-        <w:t xml:space="preserve">RDD-YOLO vs. baseline YOLOv5 on steel defect datasets [2]</w:t>
+        <w:t xml:space="preserve">RDD-YOLO vs. baseline YOLOv5 on steel defect datasets</w:t>
+      </w:r>
+      <w:r>
+        <w:t xml:space="preserve"> </w:t>
+      </w:r>
+      <w:r>
+        <w:t xml:space="preserve">[</w:t>
+      </w:r>
+      <w:r>
+        <w:t xml:space="preserve">2</w:t>
+      </w:r>
+      <w:r>
+        <w:t xml:space="preserve">]</w:t>
       </w:r>
     </w:p>
     <w:tbl>
@@ -390,7 +477,166 @@
         <w:pStyle w:val="a3"/>
       </w:pPr>
       <w:r>
-        <w:t xml:space="preserve">Industry 4.0 has pushed artificial intelligence, cloud computing, and machine vision into inspection lines together instead of as separate tools [6][7][9]. Six-axis industrial arms carrying cameras, laser scanners, ultrasonic sensors, and CMM probes can run a programmed inspection plan from several angles in a single cycle, and purpose-built platforms like RIPTIDE show the same idea aimed specifically at part inspection rather than general manipulation [8]. Collaborative robots extend that same reach into shared workspaces without needing a safety cage [12]. Autonomous mobile robots equipped with LiDAR and cameras push inspection even further, like a rail-mounted platform built for concrete quality inspection on aerial building machines [10], patrolling a facility for preventive maintenance and working in places too hazardous to send a person. Sensor fusion, combining cameras, LiDAR, thermal, and ultrasonic data, gives a more complete picture of a part’s condition than any one sensor could on its own [11], and letting a robot revise its own inspection program based on what it observes is an active area of research [13]. The obstacles that keep showing up are the sheer volume of labeled data deep learning needs and the up-front cost of a full robotic cell, both of which still price out a lot of smaller manufacturers. Where [11] fuses multiple sensors on a dedicated metrology platform and [12] targets manipulation of metallic surfaces with a purpose-built cobot, the system proposed here differs by folding defect detection and dimensional measurement into the motion plan of one general-purpose arm, so the same kinematic model that positions the camera also positions the laser probe; and unlike the self-revising inspection programs surveyed in [13], viewpoint re-planning here is triggered only by a candidate defect, keeping the baseline cycle deterministic.</w:t>
+        <w:t xml:space="preserve">Industry 4.0 has pushed artificial intelligence, cloud computing, and machine vision into inspection lines together instead of as separate tools</w:t>
+      </w:r>
+      <w:r>
+        <w:t xml:space="preserve"> </w:t>
+      </w:r>
+      <w:r>
+        <w:t xml:space="preserve">[</w:t>
+      </w:r>
+      <w:r>
+        <w:t xml:space="preserve">6</w:t>
+      </w:r>
+      <w:r>
+        <w:t xml:space="preserve">]</w:t>
+      </w:r>
+      <w:r>
+        <w:t xml:space="preserve">[</w:t>
+      </w:r>
+      <w:r>
+        <w:t xml:space="preserve">7</w:t>
+      </w:r>
+      <w:r>
+        <w:t xml:space="preserve">]</w:t>
+      </w:r>
+      <w:r>
+        <w:t xml:space="preserve">[</w:t>
+      </w:r>
+      <w:r>
+        <w:t xml:space="preserve">9</w:t>
+      </w:r>
+      <w:r>
+        <w:t xml:space="preserve">]</w:t>
+      </w:r>
+      <w:r>
+        <w:t xml:space="preserve">. Six-axis industrial arms carrying cameras, laser scanners, ultrasonic sensors, and CMM probes can run a programmed inspection plan from several angles in a single cycle, and purpose-built platforms like RIPTIDE show the same idea aimed specifically at part inspection rather than general manipulation</w:t>
+      </w:r>
+      <w:r>
+        <w:t xml:space="preserve"> </w:t>
+      </w:r>
+      <w:r>
+        <w:t xml:space="preserve">[</w:t>
+      </w:r>
+      <w:r>
+        <w:t xml:space="preserve">8</w:t>
+      </w:r>
+      <w:r>
+        <w:t xml:space="preserve">]</w:t>
+      </w:r>
+      <w:r>
+        <w:t xml:space="preserve">. Collaborative robots extend that same reach into shared workspaces without needing a safety cage</w:t>
+      </w:r>
+      <w:r>
+        <w:t xml:space="preserve"> </w:t>
+      </w:r>
+      <w:r>
+        <w:t xml:space="preserve">[</w:t>
+      </w:r>
+      <w:r>
+        <w:t xml:space="preserve">12</w:t>
+      </w:r>
+      <w:r>
+        <w:t xml:space="preserve">]</w:t>
+      </w:r>
+      <w:r>
+        <w:t xml:space="preserve">. Autonomous mobile robots equipped with LiDAR and cameras push inspection even further, like a rail-mounted platform built for concrete quality inspection on aerial building machines</w:t>
+      </w:r>
+      <w:r>
+        <w:t xml:space="preserve"> </w:t>
+      </w:r>
+      <w:r>
+        <w:t xml:space="preserve">[</w:t>
+      </w:r>
+      <w:r>
+        <w:t xml:space="preserve">10</w:t>
+      </w:r>
+      <w:r>
+        <w:t xml:space="preserve">]</w:t>
+      </w:r>
+      <w:r>
+        <w:t xml:space="preserve">, patrolling a facility for preventive maintenance and working in places too hazardous to send a person. Sensor fusion, combining cameras, LiDAR, thermal, and ultrasonic data, gives a more complete picture of a part’s condition than any one sensor could on its own</w:t>
+      </w:r>
+      <w:r>
+        <w:t xml:space="preserve"> </w:t>
+      </w:r>
+      <w:r>
+        <w:t xml:space="preserve">[</w:t>
+      </w:r>
+      <w:r>
+        <w:t xml:space="preserve">11</w:t>
+      </w:r>
+      <w:r>
+        <w:t xml:space="preserve">]</w:t>
+      </w:r>
+      <w:r>
+        <w:t xml:space="preserve">, and letting a robot revise its own inspection program based on what it observes is an active area of research</w:t>
+      </w:r>
+      <w:r>
+        <w:t xml:space="preserve"> </w:t>
+      </w:r>
+      <w:r>
+        <w:t xml:space="preserve">[</w:t>
+      </w:r>
+      <w:r>
+        <w:t xml:space="preserve">13</w:t>
+      </w:r>
+      <w:r>
+        <w:t xml:space="preserve">]</w:t>
+      </w:r>
+      <w:r>
+        <w:t xml:space="preserve">. The obstacles that keep showing up are the sheer volume of labeled data deep learning needs and the up-front cost of a full robotic cell, both of which still price out a lot of smaller manufacturers. Where</w:t>
+      </w:r>
+      <w:r>
+        <w:t xml:space="preserve"> </w:t>
+      </w:r>
+      <w:r>
+        <w:t xml:space="preserve">[</w:t>
+      </w:r>
+      <w:r>
+        <w:t xml:space="preserve">11</w:t>
+      </w:r>
+      <w:r>
+        <w:t xml:space="preserve">]</w:t>
+      </w:r>
+      <w:r>
+        <w:t xml:space="preserve"> </w:t>
+      </w:r>
+      <w:r>
+        <w:t xml:space="preserve">fuses multiple sensors on a dedicated metrology platform and</w:t>
+      </w:r>
+      <w:r>
+        <w:t xml:space="preserve"> </w:t>
+      </w:r>
+      <w:r>
+        <w:t xml:space="preserve">[</w:t>
+      </w:r>
+      <w:r>
+        <w:t xml:space="preserve">12</w:t>
+      </w:r>
+      <w:r>
+        <w:t xml:space="preserve">]</w:t>
+      </w:r>
+      <w:r>
+        <w:t xml:space="preserve"> </w:t>
+      </w:r>
+      <w:r>
+        <w:t xml:space="preserve">targets manipulation of metallic surfaces with a purpose-built cobot, the system proposed here differs by folding defect detection and dimensional measurement into the motion plan of one general-purpose arm, so the same kinematic model that positions the camera also positions the laser probe; and unlike the self-revising inspection programs surveyed in</w:t>
+      </w:r>
+      <w:r>
+        <w:t xml:space="preserve"> </w:t>
+      </w:r>
+      <w:r>
+        <w:t xml:space="preserve">[</w:t>
+      </w:r>
+      <w:r>
+        <w:t xml:space="preserve">13</w:t>
+      </w:r>
+      <w:r>
+        <w:t xml:space="preserve">]</w:t>
+      </w:r>
+      <w:r>
+        <w:t xml:space="preserve">, viewpoint re-planning here is triggered only by a candidate defect, keeping the baseline cycle deterministic.</w:t>
       </w:r>
     </w:p>
     <w:bookmarkEnd w:id="12"/>
@@ -408,7 +654,22 @@
         <w:pStyle w:val="a3"/>
       </w:pPr>
       <w:r>
-        <w:t xml:space="preserve">Contact-based inspection is solving a different problem than vision: instead of imaging a surface, a probe actually has to touch it accurately, and in some cases stay in contact with it. ACES is a teleoperated, force-controlled six-degree-of-freedom arm built for inspecting the inside of pipes, and its contact sensor locates each touch point relative to the robot’s base frame [14]. The system is expensive and hard to control once the pipe geometry includes elbows or branch fittings, according to the authors, but it sets up the geometric idea this project leans on in Section III: five contact points, as long as no four of them sit on the same plane, are enough to fully determine a cylinder. A 2025 study in</w:t>
+        <w:t xml:space="preserve">Contact-based inspection is solving a different problem than vision: instead of imaging a surface, a probe actually has to touch it accurately, and in some cases stay in contact with it. ACES is a teleoperated, force-controlled six-degree-of-freedom arm built for inspecting the inside of pipes, and its contact sensor locates each touch point relative to the robot’s base frame</w:t>
+      </w:r>
+      <w:r>
+        <w:t xml:space="preserve"> </w:t>
+      </w:r>
+      <w:r>
+        <w:t xml:space="preserve">[</w:t>
+      </w:r>
+      <w:r>
+        <w:t xml:space="preserve">14</w:t>
+      </w:r>
+      <w:r>
+        <w:t xml:space="preserve">]</w:t>
+      </w:r>
+      <w:r>
+        <w:t xml:space="preserve">. The system is expensive and hard to control once the pipe geometry includes elbows or branch fittings, according to the authors, but it sets up the geometric idea this project leans on in Section III: five contact points, as long as no four of them sit on the same plane, are enough to fully determine a cylinder. A 2025 study in</w:t>
       </w:r>
       <w:r>
         <w:t xml:space="preserve"> </w:t>
@@ -424,7 +685,181 @@
         <w:t xml:space="preserve"> </w:t>
       </w:r>
       <w:r>
-        <w:t xml:space="preserve">built a robotic ultrasound scanner with an adjustable constant-force end effector, combining a passive spring-like mechanism with active force control to keep the probe in consistent contact with skin [15]. A co-robotic mammography system breaks contact scanning into three phases, approach, contact, and a linear scan under proportional-integral-derivative (PID) force control, holding a target contact force while it tracks gentle changes in surface curvature [16]. A 2024 paper on automatic contact-based 3D scanning uses an open-loop six-degree-of-freedom arm with a digitizer probe and closed-form inverse kinematics to plan straight-line paths point to point, and it was validated against ASME B89.4.22 with sub-millimeter repeatability [17]. Reviews of collaborative robots in quality control describe a sharp shift toward in-process inspection between 2014 and 2023, and tie that shift to the push toward zero-defect manufacturing under Industry 5.0 [18][19]. The force-controlled scanners in [15] and [16] hold a probe against a compliant surface, and the ACES arm [14] carries its contact sensor into confined pipe geometry, while the system proposed here inspects rigid manufactured parts in an open cell and can therefore trade continuous contact force control for non-contact laser and depth sensing, which removes the 7 mm class of positional repeatability those systems accept. Against [17] and the cobot deployments surveyed in [18] and [19], the difference is scope rather than mechanism: those systems perform dimensional capture or generic in-process checks as dedicated tasks, whereas the framework here schedules dimensional measurement and visual defect screening inside one inspection cycle on one arm. Table II lays out all the reviewed sources side by side.</w:t>
+        <w:t xml:space="preserve">built a robotic ultrasound scanner with an adjustable constant-force end effector, combining a passive spring-like mechanism with active force control to keep the probe in consistent contact with skin</w:t>
+      </w:r>
+      <w:r>
+        <w:t xml:space="preserve"> </w:t>
+      </w:r>
+      <w:r>
+        <w:t xml:space="preserve">[</w:t>
+      </w:r>
+      <w:r>
+        <w:t xml:space="preserve">15</w:t>
+      </w:r>
+      <w:r>
+        <w:t xml:space="preserve">]</w:t>
+      </w:r>
+      <w:r>
+        <w:t xml:space="preserve">. A co-robotic mammography system breaks contact scanning into three phases, approach, contact, and a linear scan under proportional-integral-derivative (PID) force control, holding a target contact force while it tracks gentle changes in surface curvature</w:t>
+      </w:r>
+      <w:r>
+        <w:t xml:space="preserve"> </w:t>
+      </w:r>
+      <w:r>
+        <w:t xml:space="preserve">[</w:t>
+      </w:r>
+      <w:r>
+        <w:t xml:space="preserve">16</w:t>
+      </w:r>
+      <w:r>
+        <w:t xml:space="preserve">]</w:t>
+      </w:r>
+      <w:r>
+        <w:t xml:space="preserve">. A 2024 paper on automatic contact-based 3D scanning uses an open-loop six-degree-of-freedom arm with a digitizer probe and closed-form inverse kinematics to plan straight-line paths point to point, and it was validated against ASME B89.4.22 with sub-millimeter repeatability</w:t>
+      </w:r>
+      <w:r>
+        <w:t xml:space="preserve"> </w:t>
+      </w:r>
+      <w:r>
+        <w:t xml:space="preserve">[</w:t>
+      </w:r>
+      <w:r>
+        <w:t xml:space="preserve">17</w:t>
+      </w:r>
+      <w:r>
+        <w:t xml:space="preserve">]</w:t>
+      </w:r>
+      <w:r>
+        <w:t xml:space="preserve">. Reviews of collaborative robots in quality control describe a sharp shift toward in-process inspection between 2014 and 2023, and tie that shift to the push toward zero-defect manufacturing under Industry 5.0</w:t>
+      </w:r>
+      <w:r>
+        <w:t xml:space="preserve"> </w:t>
+      </w:r>
+      <w:r>
+        <w:t xml:space="preserve">[</w:t>
+      </w:r>
+      <w:r>
+        <w:t xml:space="preserve">18</w:t>
+      </w:r>
+      <w:r>
+        <w:t xml:space="preserve">]</w:t>
+      </w:r>
+      <w:r>
+        <w:t xml:space="preserve">[</w:t>
+      </w:r>
+      <w:r>
+        <w:t xml:space="preserve">19</w:t>
+      </w:r>
+      <w:r>
+        <w:t xml:space="preserve">]</w:t>
+      </w:r>
+      <w:r>
+        <w:t xml:space="preserve">. The force-controlled scanners in</w:t>
+      </w:r>
+      <w:r>
+        <w:t xml:space="preserve"> </w:t>
+      </w:r>
+      <w:r>
+        <w:t xml:space="preserve">[</w:t>
+      </w:r>
+      <w:r>
+        <w:t xml:space="preserve">15</w:t>
+      </w:r>
+      <w:r>
+        <w:t xml:space="preserve">]</w:t>
+      </w:r>
+      <w:r>
+        <w:t xml:space="preserve"> </w:t>
+      </w:r>
+      <w:r>
+        <w:t xml:space="preserve">and</w:t>
+      </w:r>
+      <w:r>
+        <w:t xml:space="preserve"> </w:t>
+      </w:r>
+      <w:r>
+        <w:t xml:space="preserve">[</w:t>
+      </w:r>
+      <w:r>
+        <w:t xml:space="preserve">16</w:t>
+      </w:r>
+      <w:r>
+        <w:t xml:space="preserve">]</w:t>
+      </w:r>
+      <w:r>
+        <w:t xml:space="preserve"> </w:t>
+      </w:r>
+      <w:r>
+        <w:t xml:space="preserve">hold a probe against a compliant surface, and the ACES arm</w:t>
+      </w:r>
+      <w:r>
+        <w:t xml:space="preserve"> </w:t>
+      </w:r>
+      <w:r>
+        <w:t xml:space="preserve">[</w:t>
+      </w:r>
+      <w:r>
+        <w:t xml:space="preserve">14</w:t>
+      </w:r>
+      <w:r>
+        <w:t xml:space="preserve">]</w:t>
+      </w:r>
+      <w:r>
+        <w:t xml:space="preserve"> </w:t>
+      </w:r>
+      <w:r>
+        <w:t xml:space="preserve">carries its contact sensor into confined pipe geometry, while the system proposed here inspects rigid manufactured parts in an open cell and can therefore trade continuous contact force control for non-contact laser and depth sensing, which removes the 7 mm class of positional repeatability those systems accept. Against</w:t>
+      </w:r>
+      <w:r>
+        <w:t xml:space="preserve"> </w:t>
+      </w:r>
+      <w:r>
+        <w:t xml:space="preserve">[</w:t>
+      </w:r>
+      <w:r>
+        <w:t xml:space="preserve">17</w:t>
+      </w:r>
+      <w:r>
+        <w:t xml:space="preserve">]</w:t>
+      </w:r>
+      <w:r>
+        <w:t xml:space="preserve"> </w:t>
+      </w:r>
+      <w:r>
+        <w:t xml:space="preserve">and the cobot deployments surveyed in</w:t>
+      </w:r>
+      <w:r>
+        <w:t xml:space="preserve"> </w:t>
+      </w:r>
+      <w:r>
+        <w:t xml:space="preserve">[</w:t>
+      </w:r>
+      <w:r>
+        <w:t xml:space="preserve">18</w:t>
+      </w:r>
+      <w:r>
+        <w:t xml:space="preserve">]</w:t>
+      </w:r>
+      <w:r>
+        <w:t xml:space="preserve"> </w:t>
+      </w:r>
+      <w:r>
+        <w:t xml:space="preserve">and</w:t>
+      </w:r>
+      <w:r>
+        <w:t xml:space="preserve"> </w:t>
+      </w:r>
+      <w:r>
+        <w:t xml:space="preserve">[</w:t>
+      </w:r>
+      <w:r>
+        <w:t xml:space="preserve">19</w:t>
+      </w:r>
+      <w:r>
+        <w:t xml:space="preserve">]</w:t>
+      </w:r>
+      <w:r>
+        <w:t xml:space="preserve">, the difference is scope rather than mechanism: those systems perform dimensional capture or generic in-process checks as dedicated tasks, whereas the framework here schedules dimensional measurement and visual defect screening inside one inspection cycle on one arm. Table II lays out all the reviewed sources side by side.</w:t>
       </w:r>
     </w:p>
     <w:bookmarkStart w:id="13" w:name="tab:litsummary"/>
@@ -445,9 +880,9 @@
         <w:tblCaption w:val="Summary of reviewed vision- and contact-based approaches"/>
       </w:tblPr>
       <w:tblGrid>
-        <w:gridCol w:w="633"/>
-        <w:gridCol w:w="3168"/>
-        <w:gridCol w:w="3168"/>
+        <w:gridCol w:w="1108"/>
+        <w:gridCol w:w="2930"/>
+        <w:gridCol w:w="2930"/>
       </w:tblGrid>
       <w:tr>
         <w:trPr>
@@ -496,7 +931,17 @@
           <w:p>
             <w:pPr>
               <w:pStyle w:val="tablecopy"/>
-            </w:pPr>
+              <w:jc w:val="left"/>
+            </w:pPr>
+            <w:r>
+              <w:t xml:space="preserve">[</w:t>
+            </w:r>
+            <w:r>
+              <w:t xml:space="preserve">1</w:t>
+            </w:r>
+            <w:r>
+              <w:t xml:space="preserve">]</w:t>
+            </w:r>
           </w:p>
         </w:tc>
         <w:tc>
@@ -530,7 +975,17 @@
           <w:p>
             <w:pPr>
               <w:pStyle w:val="tablecopy"/>
-            </w:pPr>
+              <w:jc w:val="left"/>
+            </w:pPr>
+            <w:r>
+              <w:t xml:space="preserve">[</w:t>
+            </w:r>
+            <w:r>
+              <w:t xml:space="preserve">2</w:t>
+            </w:r>
+            <w:r>
+              <w:t xml:space="preserve">]</w:t>
+            </w:r>
           </w:p>
         </w:tc>
         <w:tc>
@@ -564,7 +1019,17 @@
           <w:p>
             <w:pPr>
               <w:pStyle w:val="tablecopy"/>
-            </w:pPr>
+              <w:jc w:val="left"/>
+            </w:pPr>
+            <w:r>
+              <w:t xml:space="preserve">[</w:t>
+            </w:r>
+            <w:r>
+              <w:t xml:space="preserve">5</w:t>
+            </w:r>
+            <w:r>
+              <w:t xml:space="preserve">]</w:t>
+            </w:r>
           </w:p>
         </w:tc>
         <w:tc>
@@ -598,7 +1063,17 @@
           <w:p>
             <w:pPr>
               <w:pStyle w:val="tablecopy"/>
-            </w:pPr>
+              <w:jc w:val="left"/>
+            </w:pPr>
+            <w:r>
+              <w:t xml:space="preserve">[</w:t>
+            </w:r>
+            <w:r>
+              <w:t xml:space="preserve">14</w:t>
+            </w:r>
+            <w:r>
+              <w:t xml:space="preserve">]</w:t>
+            </w:r>
           </w:p>
         </w:tc>
         <w:tc>
@@ -632,7 +1107,17 @@
           <w:p>
             <w:pPr>
               <w:pStyle w:val="tablecopy"/>
-            </w:pPr>
+              <w:jc w:val="left"/>
+            </w:pPr>
+            <w:r>
+              <w:t xml:space="preserve">[</w:t>
+            </w:r>
+            <w:r>
+              <w:t xml:space="preserve">16</w:t>
+            </w:r>
+            <w:r>
+              <w:t xml:space="preserve">]</w:t>
+            </w:r>
           </w:p>
         </w:tc>
         <w:tc>
@@ -666,7 +1151,17 @@
           <w:p>
             <w:pPr>
               <w:pStyle w:val="tablecopy"/>
-            </w:pPr>
+              <w:jc w:val="left"/>
+            </w:pPr>
+            <w:r>
+              <w:t xml:space="preserve">[</w:t>
+            </w:r>
+            <w:r>
+              <w:t xml:space="preserve">17</w:t>
+            </w:r>
+            <w:r>
+              <w:t xml:space="preserve">]</w:t>
+            </w:r>
           </w:p>
         </w:tc>
         <w:tc>
@@ -712,7 +1207,25 @@
         <w:pStyle w:val="a3"/>
       </w:pPr>
       <w:r>
-        <w:t xml:space="preserve">Three of the contact-based papers end up anchoring the proposed methodology, mostly because each one relaxes an assumption the other two hold fixed. Reference [17] solves inverse kinematics in closed form to drive a touch probe to a contact point. The end effector’s pose gets written as a</w:t>
+        <w:t xml:space="preserve">Three of the contact-based papers end up anchoring the proposed methodology, mostly because each one relaxes an assumption the other two hold fixed. Reference</w:t>
+      </w:r>
+      <w:r>
+        <w:t xml:space="preserve"> </w:t>
+      </w:r>
+      <w:r>
+        <w:t xml:space="preserve">[</w:t>
+      </w:r>
+      <w:r>
+        <w:t xml:space="preserve">17</w:t>
+      </w:r>
+      <w:r>
+        <w:t xml:space="preserve">]</w:t>
+      </w:r>
+      <w:r>
+        <w:t xml:space="preserve"> </w:t>
+      </w:r>
+      <w:r>
+        <w:t xml:space="preserve">solves inverse kinematics in closed form to drive a touch probe to a contact point. The end effector’s pose gets written as a</w:t>
       </w:r>
       <w:r>
         <w:t xml:space="preserve"> </w:t>
@@ -771,7 +1284,25 @@
         <w:pStyle w:val="a3"/>
       </w:pPr>
       <w:r>
-        <w:t xml:space="preserve">Reference [14] (ACES) asks a narrower geometric question instead: how few contact points does it actually take to describe a cylinder. Touch five points on a cylindrical wall, as long as no four of them are coplanar, and that is enough to solve for the axis direction</w:t>
+        <w:t xml:space="preserve">Reference</w:t>
+      </w:r>
+      <w:r>
+        <w:t xml:space="preserve"> </w:t>
+      </w:r>
+      <w:r>
+        <w:t xml:space="preserve">[</w:t>
+      </w:r>
+      <w:r>
+        <w:t xml:space="preserve">14</w:t>
+      </w:r>
+      <w:r>
+        <w:t xml:space="preserve">]</w:t>
+      </w:r>
+      <w:r>
+        <w:t xml:space="preserve"> </w:t>
+      </w:r>
+      <w:r>
+        <w:t xml:space="preserve">(ACES) asks a narrower geometric question instead: how few contact points does it actually take to describe a cylinder. Touch five points on a cylindrical wall, as long as no four of them are coplanar, and that is enough to solve for the axis direction</w:t>
       </w:r>
       <w:r>
         <w:t xml:space="preserve"> </w:t>
@@ -819,7 +1350,61 @@
         <w:pStyle w:val="a3"/>
       </w:pPr>
       <w:r>
-        <w:t xml:space="preserve">Reference [16] picks up something [14] and [17] both skip over: a surface that is not rigid. The probe velocity splits into a tangential piece that holds a fixed scan speed and a normal piece driven by a PID law reacting to the gap between measured and target contact force,</w:t>
+        <w:t xml:space="preserve">Reference</w:t>
+      </w:r>
+      <w:r>
+        <w:t xml:space="preserve"> </w:t>
+      </w:r>
+      <w:r>
+        <w:t xml:space="preserve">[</w:t>
+      </w:r>
+      <w:r>
+        <w:t xml:space="preserve">16</w:t>
+      </w:r>
+      <w:r>
+        <w:t xml:space="preserve">]</w:t>
+      </w:r>
+      <w:r>
+        <w:t xml:space="preserve"> </w:t>
+      </w:r>
+      <w:r>
+        <w:t xml:space="preserve">picks up something</w:t>
+      </w:r>
+      <w:r>
+        <w:t xml:space="preserve"> </w:t>
+      </w:r>
+      <w:r>
+        <w:t xml:space="preserve">[</w:t>
+      </w:r>
+      <w:r>
+        <w:t xml:space="preserve">14</w:t>
+      </w:r>
+      <w:r>
+        <w:t xml:space="preserve">]</w:t>
+      </w:r>
+      <w:r>
+        <w:t xml:space="preserve"> </w:t>
+      </w:r>
+      <w:r>
+        <w:t xml:space="preserve">and</w:t>
+      </w:r>
+      <w:r>
+        <w:t xml:space="preserve"> </w:t>
+      </w:r>
+      <w:r>
+        <w:t xml:space="preserve">[</w:t>
+      </w:r>
+      <w:r>
+        <w:t xml:space="preserve">17</w:t>
+      </w:r>
+      <w:r>
+        <w:t xml:space="preserve">]</w:t>
+      </w:r>
+      <w:r>
+        <w:t xml:space="preserve"> </w:t>
+      </w:r>
+      <w:r>
+        <w:t xml:space="preserve">both skip over: a surface that is not rigid. The probe velocity splits into a tangential piece that holds a fixed scan speed and a normal piece driven by a PID law reacting to the gap between measured and target contact force,</w:t>
       </w:r>
     </w:p>
     <w:p>
@@ -1262,7 +1847,37 @@
         <w:t xml:space="preserve"> </w:t>
       </w:r>
       <w:r>
-        <w:t xml:space="preserve">N against a 5 N target across twenty trials, with about 7 mm of positional repeatability, which is too coarse for dimensional work but good enough to keep the probe in stable contact. Table III lines the three anchor methods up side by side; together they point toward a design that borrows [17]’s closed-form kinematics and [16]’s tolerance for an imperfect contact surface, but applied to a rigid manufactured part instead of skin.</w:t>
+        <w:t xml:space="preserve">N against a 5 N target across twenty trials, with about 7 mm of positional repeatability, which is too coarse for dimensional work but good enough to keep the probe in stable contact. Table III lines the three anchor methods up side by side; together they point toward a design that borrows</w:t>
+      </w:r>
+      <w:r>
+        <w:t xml:space="preserve"> </w:t>
+      </w:r>
+      <w:r>
+        <w:t xml:space="preserve">[</w:t>
+      </w:r>
+      <w:r>
+        <w:t xml:space="preserve">17</w:t>
+      </w:r>
+      <w:r>
+        <w:t xml:space="preserve">]</w:t>
+      </w:r>
+      <w:r>
+        <w:t xml:space="preserve">’s closed-form kinematics and</w:t>
+      </w:r>
+      <w:r>
+        <w:t xml:space="preserve"> </w:t>
+      </w:r>
+      <w:r>
+        <w:t xml:space="preserve">[</w:t>
+      </w:r>
+      <w:r>
+        <w:t xml:space="preserve">16</w:t>
+      </w:r>
+      <w:r>
+        <w:t xml:space="preserve">]</w:t>
+      </w:r>
+      <w:r>
+        <w:t xml:space="preserve">’s tolerance for an imperfect contact surface, but applied to a rigid manufactured part instead of skin.</w:t>
       </w:r>
     </w:p>
     <w:bookmarkStart w:id="16" w:name="tab:anchor"/>
@@ -1283,9 +1898,9 @@
         <w:tblCaption w:val="Comparison of anchor contact-based methods"/>
       </w:tblPr>
       <w:tblGrid>
-        <w:gridCol w:w="633"/>
-        <w:gridCol w:w="3247"/>
-        <w:gridCol w:w="3088"/>
+        <w:gridCol w:w="1108"/>
+        <w:gridCol w:w="3009"/>
+        <w:gridCol w:w="2851"/>
       </w:tblGrid>
       <w:tr>
         <w:trPr>
@@ -1334,7 +1949,17 @@
           <w:p>
             <w:pPr>
               <w:pStyle w:val="tablecopy"/>
-            </w:pPr>
+              <w:jc w:val="left"/>
+            </w:pPr>
+            <w:r>
+              <w:t xml:space="preserve">[</w:t>
+            </w:r>
+            <w:r>
+              <w:t xml:space="preserve">17</w:t>
+            </w:r>
+            <w:r>
+              <w:t xml:space="preserve">]</w:t>
+            </w:r>
           </w:p>
         </w:tc>
         <w:tc>
@@ -1368,7 +1993,17 @@
           <w:p>
             <w:pPr>
               <w:pStyle w:val="tablecopy"/>
-            </w:pPr>
+              <w:jc w:val="left"/>
+            </w:pPr>
+            <w:r>
+              <w:t xml:space="preserve">[</w:t>
+            </w:r>
+            <w:r>
+              <w:t xml:space="preserve">14</w:t>
+            </w:r>
+            <w:r>
+              <w:t xml:space="preserve">]</w:t>
+            </w:r>
           </w:p>
         </w:tc>
         <w:tc>
@@ -1402,7 +2037,17 @@
           <w:p>
             <w:pPr>
               <w:pStyle w:val="tablecopy"/>
-            </w:pPr>
+              <w:jc w:val="left"/>
+            </w:pPr>
+            <w:r>
+              <w:t xml:space="preserve">[</w:t>
+            </w:r>
+            <w:r>
+              <w:t xml:space="preserve">16</w:t>
+            </w:r>
+            <w:r>
+              <w:t xml:space="preserve">]</w:t>
+            </w:r>
           </w:p>
         </w:tc>
         <w:tc>
@@ -2681,7 +3326,22 @@
         <w:t xml:space="preserve"> </w:t>
       </w:r>
       <w:r>
-        <w:t xml:space="preserve">built straight from ABB’s own kinematic and visual description, so the forward-kinematics chain, joint limits, and inverse-kinematics results below all trace back to that model directly. The ABB IRB 120 got picked because its last three joint axes intersect at a single point, a property the literature relies on to derive closed-form inverse kinematics for this class of arm [20]; the FANUC LR Mate 200iD shares that same layout, so the results below should carry over to either candidate from Section III. Two solvers run side by side throughout: the toolbox’s general-purpose numerical solver (damped least squares on the manipulator Jacobian, random restart enabled) and a closed-form solver generated for this arm by the toolbox’s</w:t>
+        <w:t xml:space="preserve">built straight from ABB’s own kinematic and visual description, so the forward-kinematics chain, joint limits, and inverse-kinematics results below all trace back to that model directly. The ABB IRB 120 got picked because its last three joint axes intersect at a single point, a property the literature relies on to derive closed-form inverse kinematics for this class of arm</w:t>
+      </w:r>
+      <w:r>
+        <w:t xml:space="preserve"> </w:t>
+      </w:r>
+      <w:r>
+        <w:t xml:space="preserve">[</w:t>
+      </w:r>
+      <w:r>
+        <w:t xml:space="preserve">20</w:t>
+      </w:r>
+      <w:r>
+        <w:t xml:space="preserve">]</w:t>
+      </w:r>
+      <w:r>
+        <w:t xml:space="preserve">; the FANUC LR Mate 200iD shares that same layout, so the results below should carry over to either candidate from Section III. Two solvers run side by side throughout: the toolbox’s general-purpose numerical solver (damped least squares on the manipulator Jacobian, random restart enabled) and a closed-form solver generated for this arm by the toolbox’s</w:t>
       </w:r>
       <w:r>
         <w:t xml:space="preserve"> </w:t>
@@ -2714,7 +3374,19 @@
         <w:pStyle w:val="tablehead"/>
       </w:pPr>
       <w:r>
-        <w:t xml:space="preserve">DH parameters, reference six-DOF arm [20]</w:t>
+        <w:t xml:space="preserve">DH parameters, reference six-DOF arm</w:t>
+      </w:r>
+      <w:r>
+        <w:t xml:space="preserve"> </w:t>
+      </w:r>
+      <w:r>
+        <w:t xml:space="preserve">[</w:t>
+      </w:r>
+      <w:r>
+        <w:t xml:space="preserve">20</w:t>
+      </w:r>
+      <w:r>
+        <w:t xml:space="preserve">]</w:t>
       </w:r>
     </w:p>
     <w:tbl>
@@ -6311,7 +6983,7 @@
       <w:r>
         <w:drawing>
           <wp:inline>
-            <wp:extent cx="3154680" cy="2336771"/>
+            <wp:extent cx="3154680" cy="2627786"/>
             <wp:effectExtent b="0" l="0" r="0" t="0"/>
             <wp:docPr descr="" title="" id="47" name="Picture"/>
             <a:graphic>
@@ -6332,7 +7004,7 @@
                   <pic:spPr bwMode="auto">
                     <a:xfrm>
                       <a:off x="0" y="0"/>
-                      <a:ext cx="3154680" cy="2336771"/>
+                      <a:ext cx="3154680" cy="2627786"/>
                     </a:xfrm>
                     <a:prstGeom prst="rect">
                       <a:avLst/>
@@ -6471,7 +7143,43 @@
         <w:pStyle w:val="a3"/>
       </w:pPr>
       <w:r>
-        <w:t xml:space="preserve">The first priority is building an actual physical work cell instead of continuing to lean on kinematic simulation alone, since only hardware testing will show how much gearbox backlash, joint compliance, encoder quantization, tool-center-point calibration error, thermal drift, and fixturing error add on top of the solver residuals reported in Table V; validation against a coordinate measuring machine on parts with known defects is the concrete test. The dual-solver architecture from Section VI, closed-form first for a feasibility certificate and branch seeds, numerical refinement second, and solver disagreement flagged rather than trusted, should be implemented on the real controller, along with feasibility screening of every planner-requested viewpoint before motion starts. The single false-infeasible verdict the closed-form solver produced deserves its own follow-up, since characterizing how often generated analytical solvers lose solution branches near internal tolerances matters to anyone using them as a feasibility oracle. The defect-detection network needs a bigger, more varied training set, covering different lighting conditions, materials, and defect types, since detector performance tracks labeled data quality about as consistently as anything in this field, which [3] and [4] both point out. Later versions should add ultrasonic or thermal sensing to catch internal defects that optical inspection just cannot see, and hook the system into an Industry 4.0 manufacturing stack so inspection data actually feeds predictive maintenance and process optimization instead of sitting in a log nobody looks at.</w:t>
+        <w:t xml:space="preserve">The first priority is building an actual physical work cell instead of continuing to lean on kinematic simulation alone, since only hardware testing will show how much gearbox backlash, joint compliance, encoder quantization, tool-center-point calibration error, thermal drift, and fixturing error add on top of the solver residuals reported in Table V; validation against a coordinate measuring machine on parts with known defects is the concrete test. The dual-solver architecture from Section VI, closed-form first for a feasibility certificate and branch seeds, numerical refinement second, and solver disagreement flagged rather than trusted, should be implemented on the real controller, along with feasibility screening of every planner-requested viewpoint before motion starts. The single false-infeasible verdict the closed-form solver produced deserves its own follow-up, since characterizing how often generated analytical solvers lose solution branches near internal tolerances matters to anyone using them as a feasibility oracle. The defect-detection network needs a bigger, more varied training set, covering different lighting conditions, materials, and defect types, since detector performance tracks labeled data quality about as consistently as anything in this field, which</w:t>
+      </w:r>
+      <w:r>
+        <w:t xml:space="preserve"> </w:t>
+      </w:r>
+      <w:r>
+        <w:t xml:space="preserve">[</w:t>
+      </w:r>
+      <w:r>
+        <w:t xml:space="preserve">3</w:t>
+      </w:r>
+      <w:r>
+        <w:t xml:space="preserve">]</w:t>
+      </w:r>
+      <w:r>
+        <w:t xml:space="preserve"> </w:t>
+      </w:r>
+      <w:r>
+        <w:t xml:space="preserve">and</w:t>
+      </w:r>
+      <w:r>
+        <w:t xml:space="preserve"> </w:t>
+      </w:r>
+      <w:r>
+        <w:t xml:space="preserve">[</w:t>
+      </w:r>
+      <w:r>
+        <w:t xml:space="preserve">4</w:t>
+      </w:r>
+      <w:r>
+        <w:t xml:space="preserve">]</w:t>
+      </w:r>
+      <w:r>
+        <w:t xml:space="preserve"> </w:t>
+      </w:r>
+      <w:r>
+        <w:t xml:space="preserve">both point out. Later versions should add ultrasonic or thermal sensing to catch internal defects that optical inspection just cannot see, and hook the system into an Industry 4.0 manufacturing stack so inspection data actually feeds predictive maintenance and process optimization instead of sitting in a log nobody looks at.</w:t>
       </w:r>
     </w:p>
     <w:p>
@@ -6509,7 +7217,19 @@
         <w:pStyle w:val="a3"/>
       </w:pPr>
       <w:r>
-        <w:t xml:space="preserve">[1] F. Akhyar, Y. Liu, C.-Y. Hsu, T. K. Shih, and C.-Y. Lin,</w:t>
+        <w:t xml:space="preserve">[</w:t>
+      </w:r>
+      <w:r>
+        <w:t xml:space="preserve">1</w:t>
+      </w:r>
+      <w:r>
+        <w:t xml:space="preserve">]</w:t>
+      </w:r>
+      <w:r>
+        <w:t xml:space="preserve"> </w:t>
+      </w:r>
+      <w:r>
+        <w:t xml:space="preserve">F. Akhyar, Y. Liu, C.-Y. Hsu, T. K. Shih, and C.-Y. Lin,</w:t>
       </w:r>
       <w:r>
         <w:t xml:space="preserve"> </w:t>
@@ -6536,7 +7256,19 @@
         <w:pStyle w:val="a3"/>
       </w:pPr>
       <w:r>
-        <w:t xml:space="preserve">[2] C. Zhao, X. Shu, X. Yan, X. Zuo, and F. Zhu,</w:t>
+        <w:t xml:space="preserve">[</w:t>
+      </w:r>
+      <w:r>
+        <w:t xml:space="preserve">2</w:t>
+      </w:r>
+      <w:r>
+        <w:t xml:space="preserve">]</w:t>
+      </w:r>
+      <w:r>
+        <w:t xml:space="preserve"> </w:t>
+      </w:r>
+      <w:r>
+        <w:t xml:space="preserve">C. Zhao, X. Shu, X. Yan, X. Zuo, and F. Zhu,</w:t>
       </w:r>
       <w:r>
         <w:t xml:space="preserve"> </w:t>
@@ -6563,7 +7295,19 @@
         <w:pStyle w:val="a3"/>
       </w:pPr>
       <w:r>
-        <w:t xml:space="preserve">[3] F. Bagherzadeh, T. Shafighfard, R. M. A. Khan, P. Szczuko, and M. Mieloszyk, et al.,</w:t>
+        <w:t xml:space="preserve">[</w:t>
+      </w:r>
+      <w:r>
+        <w:t xml:space="preserve">3</w:t>
+      </w:r>
+      <w:r>
+        <w:t xml:space="preserve">]</w:t>
+      </w:r>
+      <w:r>
+        <w:t xml:space="preserve"> </w:t>
+      </w:r>
+      <w:r>
+        <w:t xml:space="preserve">F. Bagherzadeh, T. Shafighfard, R. M. A. Khan, P. Szczuko, and M. Mieloszyk, et al.,</w:t>
       </w:r>
       <w:r>
         <w:t xml:space="preserve"> </w:t>
@@ -6590,7 +7334,19 @@
         <w:pStyle w:val="a3"/>
       </w:pPr>
       <w:r>
-        <w:t xml:space="preserve">[4] Y. Ma et al.,</w:t>
+        <w:t xml:space="preserve">[</w:t>
+      </w:r>
+      <w:r>
+        <w:t xml:space="preserve">4</w:t>
+      </w:r>
+      <w:r>
+        <w:t xml:space="preserve">]</w:t>
+      </w:r>
+      <w:r>
+        <w:t xml:space="preserve"> </w:t>
+      </w:r>
+      <w:r>
+        <w:t xml:space="preserve">Y. Ma et al.,</w:t>
       </w:r>
       <w:r>
         <w:t xml:space="preserve"> </w:t>
@@ -6617,7 +7373,19 @@
         <w:pStyle w:val="a3"/>
       </w:pPr>
       <w:r>
-        <w:t xml:space="preserve">[5] L. Chen, G. Bi, X. Yao, C. Tan, J. Su, N. P. H. Ng, Y. Chew, K. Liu, and S. K. Moon,</w:t>
+        <w:t xml:space="preserve">[</w:t>
+      </w:r>
+      <w:r>
+        <w:t xml:space="preserve">5</w:t>
+      </w:r>
+      <w:r>
+        <w:t xml:space="preserve">]</w:t>
+      </w:r>
+      <w:r>
+        <w:t xml:space="preserve"> </w:t>
+      </w:r>
+      <w:r>
+        <w:t xml:space="preserve">L. Chen, G. Bi, X. Yao, C. Tan, J. Su, N. P. H. Ng, Y. Chew, K. Liu, and S. K. Moon,</w:t>
       </w:r>
       <w:r>
         <w:t xml:space="preserve"> </w:t>
@@ -6644,7 +7412,19 @@
         <w:pStyle w:val="a3"/>
       </w:pPr>
       <w:r>
-        <w:t xml:space="preserve">[6] K. G. Amin, M. Patidar, P. K. Patidar, N. K. R. Rafaliya, J. Joshi, and D. Mishra,</w:t>
+        <w:t xml:space="preserve">[</w:t>
+      </w:r>
+      <w:r>
+        <w:t xml:space="preserve">6</w:t>
+      </w:r>
+      <w:r>
+        <w:t xml:space="preserve">]</w:t>
+      </w:r>
+      <w:r>
+        <w:t xml:space="preserve"> </w:t>
+      </w:r>
+      <w:r>
+        <w:t xml:space="preserve">K. G. Amin, M. Patidar, P. K. Patidar, N. K. R. Rafaliya, J. Joshi, and D. Mishra,</w:t>
       </w:r>
       <w:r>
         <w:t xml:space="preserve"> </w:t>
@@ -6677,7 +7457,19 @@
         <w:pStyle w:val="a3"/>
       </w:pPr>
       <w:r>
-        <w:t xml:space="preserve">[7] A. Villalonga, Y. J. Cruz, D. Alfaro, R. E. Haber, J. L. Martínez-Lastra, and F. Castaño,</w:t>
+        <w:t xml:space="preserve">[</w:t>
+      </w:r>
+      <w:r>
+        <w:t xml:space="preserve">7</w:t>
+      </w:r>
+      <w:r>
+        <w:t xml:space="preserve">]</w:t>
+      </w:r>
+      <w:r>
+        <w:t xml:space="preserve"> </w:t>
+      </w:r>
+      <w:r>
+        <w:t xml:space="preserve">A. Villalonga, Y. J. Cruz, D. Alfaro, R. E. Haber, J. L. Martínez-Lastra, and F. Castaño,</w:t>
       </w:r>
       <w:r>
         <w:t xml:space="preserve"> </w:t>
@@ -6710,7 +7502,19 @@
         <w:pStyle w:val="a3"/>
       </w:pPr>
       <w:r>
-        <w:t xml:space="preserve">[8] A. E. Duron, B. A. C. Stiles, and D. A. Torck,</w:t>
+        <w:t xml:space="preserve">[</w:t>
+      </w:r>
+      <w:r>
+        <w:t xml:space="preserve">8</w:t>
+      </w:r>
+      <w:r>
+        <w:t xml:space="preserve">]</w:t>
+      </w:r>
+      <w:r>
+        <w:t xml:space="preserve"> </w:t>
+      </w:r>
+      <w:r>
+        <w:t xml:space="preserve">A. E. Duron, B. A. C. Stiles, and D. A. Torck,</w:t>
       </w:r>
       <w:r>
         <w:t xml:space="preserve"> </w:t>
@@ -6743,7 +7547,19 @@
         <w:pStyle w:val="a3"/>
       </w:pPr>
       <w:r>
-        <w:t xml:space="preserve">[9] T. Brito, J. Queiroz, L. Piardi, L. A. Fernandes, J. Lima, and P. Leitão,</w:t>
+        <w:t xml:space="preserve">[</w:t>
+      </w:r>
+      <w:r>
+        <w:t xml:space="preserve">9</w:t>
+      </w:r>
+      <w:r>
+        <w:t xml:space="preserve">]</w:t>
+      </w:r>
+      <w:r>
+        <w:t xml:space="preserve"> </w:t>
+      </w:r>
+      <w:r>
+        <w:t xml:space="preserve">T. Brito, J. Queiroz, L. Piardi, L. A. Fernandes, J. Lima, and P. Leitão,</w:t>
       </w:r>
       <w:r>
         <w:t xml:space="preserve"> </w:t>
@@ -6770,7 +7586,19 @@
         <w:pStyle w:val="a3"/>
       </w:pPr>
       <w:r>
-        <w:t xml:space="preserve">[10] M. Zhou, C. Ge, and X. Xiong,</w:t>
+        <w:t xml:space="preserve">[</w:t>
+      </w:r>
+      <w:r>
+        <w:t xml:space="preserve">10</w:t>
+      </w:r>
+      <w:r>
+        <w:t xml:space="preserve">]</w:t>
+      </w:r>
+      <w:r>
+        <w:t xml:space="preserve"> </w:t>
+      </w:r>
+      <w:r>
+        <w:t xml:space="preserve">M. Zhou, C. Ge, and X. Xiong,</w:t>
       </w:r>
       <w:r>
         <w:t xml:space="preserve"> </w:t>
@@ -6803,7 +7631,19 @@
         <w:pStyle w:val="a3"/>
       </w:pPr>
       <w:r>
-        <w:t xml:space="preserve">[11] S. Discepolo and P. Castellini,</w:t>
+        <w:t xml:space="preserve">[</w:t>
+      </w:r>
+      <w:r>
+        <w:t xml:space="preserve">11</w:t>
+      </w:r>
+      <w:r>
+        <w:t xml:space="preserve">]</w:t>
+      </w:r>
+      <w:r>
+        <w:t xml:space="preserve"> </w:t>
+      </w:r>
+      <w:r>
+        <w:t xml:space="preserve">S. Discepolo and P. Castellini,</w:t>
       </w:r>
       <w:r>
         <w:t xml:space="preserve"> </w:t>
@@ -6836,7 +7676,19 @@
         <w:pStyle w:val="a3"/>
       </w:pPr>
       <w:r>
-        <w:t xml:space="preserve">[12] T. Czimmermann, M. Chiurazzi, M. Milazzo, S. Roccella, M. Barbieri, P. Dario, C. M. Oddo, and G. Ciuti,</w:t>
+        <w:t xml:space="preserve">[</w:t>
+      </w:r>
+      <w:r>
+        <w:t xml:space="preserve">12</w:t>
+      </w:r>
+      <w:r>
+        <w:t xml:space="preserve">]</w:t>
+      </w:r>
+      <w:r>
+        <w:t xml:space="preserve"> </w:t>
+      </w:r>
+      <w:r>
+        <w:t xml:space="preserve">T. Czimmermann, M. Chiurazzi, M. Milazzo, S. Roccella, M. Barbieri, P. Dario, C. M. Oddo, and G. Ciuti,</w:t>
       </w:r>
       <w:r>
         <w:t xml:space="preserve"> </w:t>
@@ -6863,7 +7715,19 @@
         <w:pStyle w:val="a3"/>
       </w:pPr>
       <w:r>
-        <w:t xml:space="preserve">[13] D. Irvine and M. Narayanan,</w:t>
+        <w:t xml:space="preserve">[</w:t>
+      </w:r>
+      <w:r>
+        <w:t xml:space="preserve">13</w:t>
+      </w:r>
+      <w:r>
+        <w:t xml:space="preserve">]</w:t>
+      </w:r>
+      <w:r>
+        <w:t xml:space="preserve"> </w:t>
+      </w:r>
+      <w:r>
+        <w:t xml:space="preserve">D. Irvine and M. Narayanan,</w:t>
       </w:r>
       <w:r>
         <w:t xml:space="preserve"> </w:t>
@@ -6896,7 +7760,13 @@
         <w:pStyle w:val="a3"/>
       </w:pPr>
       <w:r>
-        <w:t xml:space="preserve">[14]</w:t>
+        <w:t xml:space="preserve">[</w:t>
+      </w:r>
+      <w:r>
+        <w:t xml:space="preserve">14</w:t>
+      </w:r>
+      <w:r>
+        <w:t xml:space="preserve">]</w:t>
       </w:r>
       <w:r>
         <w:t xml:space="preserve"> </w:t>
@@ -6916,7 +7786,19 @@
         <w:pStyle w:val="a3"/>
       </w:pPr>
       <w:r>
-        <w:t xml:space="preserve">[15] Z. Wu et al.,</w:t>
+        <w:t xml:space="preserve">[</w:t>
+      </w:r>
+      <w:r>
+        <w:t xml:space="preserve">15</w:t>
+      </w:r>
+      <w:r>
+        <w:t xml:space="preserve">]</w:t>
+      </w:r>
+      <w:r>
+        <w:t xml:space="preserve"> </w:t>
+      </w:r>
+      <w:r>
+        <w:t xml:space="preserve">Z. Wu et al.,</w:t>
       </w:r>
       <w:r>
         <w:t xml:space="preserve"> </w:t>
@@ -6943,7 +7825,13 @@
         <w:pStyle w:val="a3"/>
       </w:pPr>
       <w:r>
-        <w:t xml:space="preserve">[16]</w:t>
+        <w:t xml:space="preserve">[</w:t>
+      </w:r>
+      <w:r>
+        <w:t xml:space="preserve">16</w:t>
+      </w:r>
+      <w:r>
+        <w:t xml:space="preserve">]</w:t>
       </w:r>
       <w:r>
         <w:t xml:space="preserve"> </w:t>
@@ -6963,7 +7851,13 @@
         <w:pStyle w:val="a3"/>
       </w:pPr>
       <w:r>
-        <w:t xml:space="preserve">[17]</w:t>
+        <w:t xml:space="preserve">[</w:t>
+      </w:r>
+      <w:r>
+        <w:t xml:space="preserve">17</w:t>
+      </w:r>
+      <w:r>
+        <w:t xml:space="preserve">]</w:t>
       </w:r>
       <w:r>
         <w:t xml:space="preserve"> </w:t>
@@ -6983,7 +7877,13 @@
         <w:pStyle w:val="a3"/>
       </w:pPr>
       <w:r>
-        <w:t xml:space="preserve">[18]</w:t>
+        <w:t xml:space="preserve">[</w:t>
+      </w:r>
+      <w:r>
+        <w:t xml:space="preserve">18</w:t>
+      </w:r>
+      <w:r>
+        <w:t xml:space="preserve">]</w:t>
       </w:r>
       <w:r>
         <w:t xml:space="preserve"> </w:t>
@@ -7010,7 +7910,19 @@
         <w:pStyle w:val="a3"/>
       </w:pPr>
       <w:r>
-        <w:t xml:space="preserve">[19] M. Al-Amin,</w:t>
+        <w:t xml:space="preserve">[</w:t>
+      </w:r>
+      <w:r>
+        <w:t xml:space="preserve">19</w:t>
+      </w:r>
+      <w:r>
+        <w:t xml:space="preserve">]</w:t>
+      </w:r>
+      <w:r>
+        <w:t xml:space="preserve"> </w:t>
+      </w:r>
+      <w:r>
+        <w:t xml:space="preserve">M. Al-Amin,</w:t>
       </w:r>
       <w:r>
         <w:t xml:space="preserve"> </w:t>
@@ -7037,7 +7949,19 @@
         <w:pStyle w:val="a3"/>
       </w:pPr>
       <w:r>
-        <w:t xml:space="preserve">[20] O. F. Seven and A. Ankarali,</w:t>
+        <w:t xml:space="preserve">[</w:t>
+      </w:r>
+      <w:r>
+        <w:t xml:space="preserve">20</w:t>
+      </w:r>
+      <w:r>
+        <w:t xml:space="preserve">]</w:t>
+      </w:r>
+      <w:r>
+        <w:t xml:space="preserve"> </w:t>
+      </w:r>
+      <w:r>
+        <w:t xml:space="preserve">O. F. Seven and A. Ankarali,</w:t>
       </w:r>
       <w:r>
         <w:t xml:space="preserve"> </w:t>

</xml_diff>